<commit_message>
docs: update professional experience and skills in resume
</commit_message>
<xml_diff>
--- a/Junaid_Ahmed_Mohammed_Resume.docx
+++ b/Junaid_Ahmed_Mohammed_Resume.docx
@@ -24,12 +24,6 @@
         <w:spacing w:after="60"/>
         <w:jc w:val="center"/>
       </w:pPr>
-      <w:r>
-        <w:rPr>
-          <w:rFonts w:ascii="Calibri" w:eastAsia="Calibri" w:hAnsi="Calibri" w:cs="Calibri"/>
-        </w:rPr>
-        <w:t xml:space="preserve">+1 317-339-3430 |  </w:t>
-      </w:r>
       <w:hyperlink r:id="rId5" w:history="1">
         <w:r>
           <w:rPr>

</xml_diff>